<commit_message>
Densify the one-page Youde CV with an honest Tung & Ngai ceiling.
Keep official T&N components on the page and state a four-year package
ceiling of about HK$520,000 only as maxima-if-drawn arithmetic, not a
Year-1 lump. Surface operator-stated selection ratios, name Nordic
fieldwork separately from the nine-day NEWDAY course, and fill unused
vertical space without leaving one page.

Co-authored-by: Shen Ruililin <bobshenruililin@users.noreply.github.com>
</commit_message>
<xml_diff>
--- a/cv/shen-ruililin-cv.docx
+++ b/cv/shen-ruililin-cv.docx
@@ -4,7 +4,7 @@
   <w:body>
     <w:p>
       <w:pPr>
-        <w:spacing w:before="0" w:after="80" w:line="320" w:lineRule="exact"/>
+        <w:spacing w:before="0" w:after="40" w:line="300" w:lineRule="exact"/>
         <w:jc w:val="center"/>
       </w:pPr>
       <w:r>
@@ -20,7 +20,23 @@
     </w:p>
     <w:p>
       <w:pPr>
-        <w:spacing w:before="0" w:after="40" w:line="260" w:lineRule="exact"/>
+        <w:spacing w:before="0" w:after="40" w:line="240" w:lineRule="exact"/>
+        <w:jc w:val="center"/>
+      </w:pPr>
+      <w:r>
+        <w:rPr>
+          <w:rFonts w:ascii="Times New Roman" w:hAnsi="Times New Roman" w:eastAsia="Times New Roman"/>
+          <w:b/>
+          <w:i w:val="0"/>
+          <w:color w:val="000000"/>
+          <w:sz w:val="20"/>
+        </w:rPr>
+        <w:t>BASc Global Health and Development, HKU  ·  Year 2  ·  CGPA 4.09/4.30</w:t>
+      </w:r>
+    </w:p>
+    <w:p>
+      <w:pPr>
+        <w:spacing w:before="0" w:after="40" w:line="240" w:lineRule="exact"/>
         <w:jc w:val="center"/>
       </w:pPr>
       <w:r>
@@ -36,10 +52,10 @@
     </w:p>
     <w:p>
       <w:pPr>
-        <w:spacing w:before="140" w:after="20" w:line="240" w:lineRule="exact"/>
+        <w:spacing w:before="80" w:after="10" w:line="220" w:lineRule="exact"/>
         <w:jc w:val="left"/>
         <w:pBdr>
-          <w:bottom w:val="single" w:sz="12" w:space="4" w:color="000000"/>
+          <w:bottom w:val="single" w:sz="11" w:space="3" w:color="000000"/>
         </w:pBdr>
       </w:pPr>
       <w:r>
@@ -55,9 +71,9 @@
     </w:p>
     <w:p>
       <w:pPr>
-        <w:spacing w:before="70" w:after="0" w:line="240" w:lineRule="exact"/>
+        <w:spacing w:before="32" w:after="0" w:line="230" w:lineRule="exact"/>
         <w:tabs>
-          <w:tab w:val="right" w:pos="10376"/>
+          <w:tab w:val="right" w:pos="10602"/>
         </w:tabs>
       </w:pPr>
       <w:r>
@@ -86,9 +102,9 @@
     </w:p>
     <w:p>
       <w:pPr>
-        <w:spacing w:before="0" w:after="10" w:line="240" w:lineRule="exact"/>
+        <w:spacing w:before="0" w:after="4" w:line="230" w:lineRule="exact"/>
         <w:tabs>
-          <w:tab w:val="right" w:pos="10376"/>
+          <w:tab w:val="right" w:pos="10602"/>
         </w:tabs>
       </w:pPr>
       <w:r>
@@ -117,7 +133,7 @@
     </w:p>
     <w:p>
       <w:pPr>
-        <w:spacing w:before="0" w:after="10" w:line="240" w:lineRule="exact"/>
+        <w:spacing w:before="0" w:after="3" w:line="230" w:lineRule="exact"/>
         <w:ind w:left="255" w:hanging="181"/>
       </w:pPr>
       <w:r>
@@ -128,14 +144,64 @@
           <w:color w:val="000000"/>
           <w:sz w:val="20"/>
         </w:rPr>
-        <w:t>•  CGPA 4.09/4.30. St. John’s College (2025–).</w:t>
+        <w:t xml:space="preserve">•  </w:t>
+      </w:r>
+      <w:r>
+        <w:rPr>
+          <w:rFonts w:ascii="Times New Roman" w:hAnsi="Times New Roman" w:eastAsia="Times New Roman"/>
+          <w:b w:val="0"/>
+          <w:i w:val="0"/>
+          <w:color w:val="000000"/>
+          <w:sz w:val="20"/>
+        </w:rPr>
+        <w:t xml:space="preserve">CGPA </w:t>
+      </w:r>
+      <w:r>
+        <w:rPr>
+          <w:rFonts w:ascii="Times New Roman" w:hAnsi="Times New Roman" w:eastAsia="Times New Roman"/>
+          <w:b/>
+          <w:i w:val="0"/>
+          <w:color w:val="000000"/>
+          <w:sz w:val="20"/>
+        </w:rPr>
+        <w:t>4.09/4.30</w:t>
+      </w:r>
+      <w:r>
+        <w:rPr>
+          <w:rFonts w:ascii="Times New Roman" w:hAnsi="Times New Roman" w:eastAsia="Times New Roman"/>
+          <w:b w:val="0"/>
+          <w:i w:val="0"/>
+          <w:color w:val="000000"/>
+          <w:sz w:val="20"/>
+        </w:rPr>
+        <w:t xml:space="preserve"> (current). </w:t>
+      </w:r>
+      <w:r>
+        <w:rPr>
+          <w:rFonts w:ascii="Times New Roman" w:hAnsi="Times New Roman" w:eastAsia="Times New Roman"/>
+          <w:b/>
+          <w:i w:val="0"/>
+          <w:color w:val="000000"/>
+          <w:sz w:val="20"/>
+        </w:rPr>
+        <w:t>St. John's College</w:t>
+      </w:r>
+      <w:r>
+        <w:rPr>
+          <w:rFonts w:ascii="Times New Roman" w:hAnsi="Times New Roman" w:eastAsia="Times New Roman"/>
+          <w:b w:val="0"/>
+          <w:i w:val="0"/>
+          <w:color w:val="000000"/>
+          <w:sz w:val="20"/>
+        </w:rPr>
+        <w:t xml:space="preserve"> (2025–). Public health, quantitative methods, and development.</w:t>
       </w:r>
     </w:p>
     <w:p>
       <w:pPr>
-        <w:spacing w:before="70" w:after="0" w:line="240" w:lineRule="exact"/>
+        <w:spacing w:before="32" w:after="0" w:line="230" w:lineRule="exact"/>
         <w:tabs>
-          <w:tab w:val="right" w:pos="10376"/>
+          <w:tab w:val="right" w:pos="10602"/>
         </w:tabs>
       </w:pPr>
       <w:r>
@@ -164,9 +230,9 @@
     </w:p>
     <w:p>
       <w:pPr>
-        <w:spacing w:before="0" w:after="10" w:line="240" w:lineRule="exact"/>
+        <w:spacing w:before="0" w:after="4" w:line="230" w:lineRule="exact"/>
         <w:tabs>
-          <w:tab w:val="right" w:pos="10376"/>
+          <w:tab w:val="right" w:pos="10602"/>
         </w:tabs>
       </w:pPr>
       <w:r>
@@ -195,7 +261,7 @@
     </w:p>
     <w:p>
       <w:pPr>
-        <w:spacing w:before="0" w:after="10" w:line="240" w:lineRule="exact"/>
+        <w:spacing w:before="0" w:after="3" w:line="230" w:lineRule="exact"/>
         <w:ind w:left="255" w:hanging="181"/>
       </w:pPr>
       <w:r>
@@ -206,15 +272,35 @@
           <w:color w:val="000000"/>
           <w:sz w:val="20"/>
         </w:rPr>
-        <w:t>•  Academic Scholarships (2022–23, 2024–25). Co-founder, Medical Club (2023–24; membership to 80+).</w:t>
+        <w:t xml:space="preserve">•  </w:t>
+      </w:r>
+      <w:r>
+        <w:rPr>
+          <w:rFonts w:ascii="Times New Roman" w:hAnsi="Times New Roman" w:eastAsia="Times New Roman"/>
+          <w:b/>
+          <w:i w:val="0"/>
+          <w:color w:val="000000"/>
+          <w:sz w:val="20"/>
+        </w:rPr>
+        <w:t>Academic Scholarships</w:t>
+      </w:r>
+      <w:r>
+        <w:rPr>
+          <w:rFonts w:ascii="Times New Roman" w:hAnsi="Times New Roman" w:eastAsia="Times New Roman"/>
+          <w:b w:val="0"/>
+          <w:i w:val="0"/>
+          <w:color w:val="000000"/>
+          <w:sz w:val="20"/>
+        </w:rPr>
+        <w:t xml:space="preserve"> (2022–23, 2024–25). Co-founder, Medical Club (2023–24; membership to 80+).</w:t>
       </w:r>
     </w:p>
     <w:p>
       <w:pPr>
-        <w:spacing w:before="140" w:after="20" w:line="240" w:lineRule="exact"/>
+        <w:spacing w:before="80" w:after="10" w:line="220" w:lineRule="exact"/>
         <w:jc w:val="left"/>
         <w:pBdr>
-          <w:bottom w:val="single" w:sz="12" w:space="4" w:color="000000"/>
+          <w:bottom w:val="single" w:sz="11" w:space="3" w:color="000000"/>
         </w:pBdr>
       </w:pPr>
       <w:r>
@@ -225,12 +311,12 @@
           <w:color w:val="000000"/>
           <w:sz w:val="22"/>
         </w:rPr>
-        <w:t>SELECTED HONOURS</w:t>
+        <w:t>HONOURS AND AWARDS</w:t>
       </w:r>
     </w:p>
     <w:p>
       <w:pPr>
-        <w:spacing w:before="0" w:after="30" w:line="240" w:lineRule="exact"/>
+        <w:spacing w:before="0" w:after="10" w:line="230" w:lineRule="exact"/>
       </w:pPr>
       <w:r>
         <w:rPr>
@@ -240,7 +326,7 @@
           <w:color w:val="000000"/>
           <w:sz w:val="20"/>
         </w:rPr>
-        <w:t>Tung and Ngai Foundation Scholarship, 2025–26</w:t>
+        <w:t>Tung and Ngai Foundation Scholarship</w:t>
       </w:r>
       <w:r>
         <w:rPr>
@@ -250,12 +336,92 @@
           <w:color w:val="000000"/>
           <w:sz w:val="20"/>
         </w:rPr>
-        <w:t xml:space="preserve"> — full tuition; living allowance HK$40,000; overseas/Mainland learning subsidy (max HK$80,000); Endeavour Support Fund (up to HK$100,000).</w:t>
+        <w:t xml:space="preserve"> (2025–; 1 of 4 HKU scholars). Full HKU tuition; living </w:t>
+      </w:r>
+      <w:r>
+        <w:rPr>
+          <w:rFonts w:ascii="Times New Roman" w:hAnsi="Times New Roman" w:eastAsia="Times New Roman"/>
+          <w:b/>
+          <w:i w:val="0"/>
+          <w:color w:val="000000"/>
+          <w:sz w:val="20"/>
+        </w:rPr>
+        <w:t>HK$40,000/year</w:t>
+      </w:r>
+      <w:r>
+        <w:rPr>
+          <w:rFonts w:ascii="Times New Roman" w:hAnsi="Times New Roman" w:eastAsia="Times New Roman"/>
+          <w:b w:val="0"/>
+          <w:i w:val="0"/>
+          <w:color w:val="000000"/>
+          <w:sz w:val="20"/>
+        </w:rPr>
+        <w:t xml:space="preserve">; overseas/Mainland subsidy </w:t>
+      </w:r>
+      <w:r>
+        <w:rPr>
+          <w:rFonts w:ascii="Times New Roman" w:hAnsi="Times New Roman" w:eastAsia="Times New Roman"/>
+          <w:b/>
+          <w:i w:val="0"/>
+          <w:color w:val="000000"/>
+          <w:sz w:val="20"/>
+        </w:rPr>
+        <w:t>max HK$80,000</w:t>
+      </w:r>
+      <w:r>
+        <w:rPr>
+          <w:rFonts w:ascii="Times New Roman" w:hAnsi="Times New Roman" w:eastAsia="Times New Roman"/>
+          <w:b w:val="0"/>
+          <w:i w:val="0"/>
+          <w:color w:val="000000"/>
+          <w:sz w:val="20"/>
+        </w:rPr>
+        <w:t xml:space="preserve">; Endeavour Support Fund </w:t>
+      </w:r>
+      <w:r>
+        <w:rPr>
+          <w:rFonts w:ascii="Times New Roman" w:hAnsi="Times New Roman" w:eastAsia="Times New Roman"/>
+          <w:b/>
+          <w:i w:val="0"/>
+          <w:color w:val="000000"/>
+          <w:sz w:val="20"/>
+        </w:rPr>
+        <w:t>up to HK$100,000</w:t>
+      </w:r>
+      <w:r>
+        <w:rPr>
+          <w:rFonts w:ascii="Times New Roman" w:hAnsi="Times New Roman" w:eastAsia="Times New Roman"/>
+          <w:b w:val="0"/>
+          <w:i w:val="0"/>
+          <w:color w:val="000000"/>
+          <w:sz w:val="20"/>
+        </w:rPr>
+        <w:t xml:space="preserve">. Four-year package ceiling </w:t>
+      </w:r>
+      <w:r>
+        <w:rPr>
+          <w:rFonts w:ascii="Times New Roman" w:hAnsi="Times New Roman" w:eastAsia="Times New Roman"/>
+          <w:b/>
+          <w:i w:val="0"/>
+          <w:color w:val="000000"/>
+          <w:sz w:val="20"/>
+        </w:rPr>
+        <w:t>up to ~HK$520,000</w:t>
+      </w:r>
+      <w:r>
+        <w:rPr>
+          <w:rFonts w:ascii="Times New Roman" w:hAnsi="Times New Roman" w:eastAsia="Times New Roman"/>
+          <w:b w:val="0"/>
+          <w:i w:val="0"/>
+          <w:color w:val="000000"/>
+          <w:sz w:val="20"/>
+        </w:rPr>
+        <w:t xml:space="preserve"> if duration and published maxima are drawn — not a single disbursement.</w:t>
       </w:r>
     </w:p>
     <w:p>
       <w:pPr>
-        <w:spacing w:before="0" w:after="30" w:line="240" w:lineRule="exact"/>
+        <w:spacing w:before="0" w:after="10" w:line="230" w:lineRule="exact"/>
       </w:pPr>
       <w:r>
         <w:rPr>
@@ -265,12 +431,42 @@
           <w:color w:val="000000"/>
           <w:sz w:val="20"/>
         </w:rPr>
-        <w:t>Laidlaw Undergraduate Research and Leadership Programme, 2025–26.</w:t>
+        <w:t>Laidlaw Undergraduate Research and Leadership Programme</w:t>
+      </w:r>
+      <w:r>
+        <w:rPr>
+          <w:rFonts w:ascii="Times New Roman" w:hAnsi="Times New Roman" w:eastAsia="Times New Roman"/>
+          <w:b w:val="0"/>
+          <w:i w:val="0"/>
+          <w:color w:val="000000"/>
+          <w:sz w:val="20"/>
+        </w:rPr>
+        <w:t xml:space="preserve">, 2025–26. Heat × cardiovascular admissions among older adults; Prof. </w:t>
+      </w:r>
+      <w:r>
+        <w:rPr>
+          <w:rFonts w:ascii="Times New Roman" w:hAnsi="Times New Roman" w:eastAsia="Times New Roman"/>
+          <w:b/>
+          <w:i w:val="0"/>
+          <w:color w:val="000000"/>
+          <w:sz w:val="20"/>
+        </w:rPr>
+        <w:t>David Bishai</w:t>
+      </w:r>
+      <w:r>
+        <w:rPr>
+          <w:rFonts w:ascii="Times New Roman" w:hAnsi="Times New Roman" w:eastAsia="Times New Roman"/>
+          <w:b w:val="0"/>
+          <w:i w:val="0"/>
+          <w:color w:val="000000"/>
+          <w:sz w:val="20"/>
+        </w:rPr>
+        <w:t>, HKU School of Public Health.</w:t>
       </w:r>
     </w:p>
     <w:p>
       <w:pPr>
-        <w:spacing w:before="0" w:after="30" w:line="240" w:lineRule="exact"/>
+        <w:spacing w:before="0" w:after="10" w:line="230" w:lineRule="exact"/>
       </w:pPr>
       <w:r>
         <w:rPr>
@@ -290,12 +486,12 @@
           <w:color w:val="000000"/>
           <w:sz w:val="20"/>
         </w:rPr>
-        <w:t>, St. John’s College, The University of Hong Kong, 2025–26.</w:t>
+        <w:t>, St. John's College, The University of Hong Kong, 2025–26.</w:t>
       </w:r>
     </w:p>
     <w:p>
       <w:pPr>
-        <w:spacing w:before="0" w:after="30" w:line="240" w:lineRule="exact"/>
+        <w:spacing w:before="0" w:after="10" w:line="230" w:lineRule="exact"/>
       </w:pPr>
       <w:r>
         <w:rPr>
@@ -305,12 +501,22 @@
           <w:color w:val="000000"/>
           <w:sz w:val="20"/>
         </w:rPr>
-        <w:t>Tam Wun Tsun HKU Horizons Student Enrichment Award, 2025–26.</w:t>
+        <w:t>Tam Wun Tsun HKU Horizons Student Enrichment Award</w:t>
+      </w:r>
+      <w:r>
+        <w:rPr>
+          <w:rFonts w:ascii="Times New Roman" w:hAnsi="Times New Roman" w:eastAsia="Times New Roman"/>
+          <w:b w:val="0"/>
+          <w:i w:val="0"/>
+          <w:color w:val="000000"/>
+          <w:sz w:val="20"/>
+        </w:rPr>
+        <w:t>, 2025–26.</w:t>
       </w:r>
     </w:p>
     <w:p>
       <w:pPr>
-        <w:spacing w:before="0" w:after="30" w:line="240" w:lineRule="exact"/>
+        <w:spacing w:before="0" w:after="10" w:line="230" w:lineRule="exact"/>
       </w:pPr>
       <w:r>
         <w:rPr>
@@ -320,12 +526,22 @@
           <w:color w:val="000000"/>
           <w:sz w:val="20"/>
         </w:rPr>
-        <w:t>MIT Hong Kong Innovation Node Youth Fellowship, 2023.</w:t>
+        <w:t>MIT Hong Kong Innovation Node Youth Fellowship</w:t>
+      </w:r>
+      <w:r>
+        <w:rPr>
+          <w:rFonts w:ascii="Times New Roman" w:hAnsi="Times New Roman" w:eastAsia="Times New Roman"/>
+          <w:b w:val="0"/>
+          <w:i w:val="0"/>
+          <w:color w:val="000000"/>
+          <w:sz w:val="20"/>
+        </w:rPr>
+        <w:t>, 2023, Hong Kong.</w:t>
       </w:r>
     </w:p>
     <w:p>
       <w:pPr>
-        <w:spacing w:before="0" w:after="30" w:line="240" w:lineRule="exact"/>
+        <w:spacing w:before="0" w:after="10" w:line="230" w:lineRule="exact"/>
       </w:pPr>
       <w:r>
         <w:rPr>
@@ -345,15 +561,35 @@
           <w:color w:val="000000"/>
           <w:sz w:val="20"/>
         </w:rPr>
-        <w:t xml:space="preserve"> (Hong Kong): Champion 2022; first runner-up 2021. Hong Kong Young Writers’ Award, Bauhinia Club Award, 2024 (1st/1400+).</w:t>
+        <w:t xml:space="preserve"> (Hong Kong): Champion 2022 (1st/16); first runner-up 2021 (2nd/8). </w:t>
+      </w:r>
+      <w:r>
+        <w:rPr>
+          <w:rFonts w:ascii="Times New Roman" w:hAnsi="Times New Roman" w:eastAsia="Times New Roman"/>
+          <w:b/>
+          <w:i w:val="0"/>
+          <w:color w:val="000000"/>
+          <w:sz w:val="20"/>
+        </w:rPr>
+        <w:t>Hong Kong Young Writers' Award</w:t>
+      </w:r>
+      <w:r>
+        <w:rPr>
+          <w:rFonts w:ascii="Times New Roman" w:hAnsi="Times New Roman" w:eastAsia="Times New Roman"/>
+          <w:b w:val="0"/>
+          <w:i w:val="0"/>
+          <w:color w:val="000000"/>
+          <w:sz w:val="20"/>
+        </w:rPr>
+        <w:t>, Bauhinia Club Award, 2024 (1st/1400+).</w:t>
       </w:r>
     </w:p>
     <w:p>
       <w:pPr>
-        <w:spacing w:before="140" w:after="20" w:line="240" w:lineRule="exact"/>
+        <w:spacing w:before="80" w:after="10" w:line="220" w:lineRule="exact"/>
         <w:jc w:val="left"/>
         <w:pBdr>
-          <w:bottom w:val="single" w:sz="12" w:space="4" w:color="000000"/>
+          <w:bottom w:val="single" w:sz="11" w:space="3" w:color="000000"/>
         </w:pBdr>
       </w:pPr>
       <w:r>
@@ -364,14 +600,14 @@
           <w:color w:val="000000"/>
           <w:sz w:val="22"/>
         </w:rPr>
-        <w:t>RESEARCH</w:t>
+        <w:t>RESEARCH EXPERIENCE</w:t>
       </w:r>
     </w:p>
     <w:p>
       <w:pPr>
-        <w:spacing w:before="70" w:after="0" w:line="240" w:lineRule="exact"/>
+        <w:spacing w:before="32" w:after="0" w:line="230" w:lineRule="exact"/>
         <w:tabs>
-          <w:tab w:val="right" w:pos="10376"/>
+          <w:tab w:val="right" w:pos="10602"/>
         </w:tabs>
       </w:pPr>
       <w:r>
@@ -400,9 +636,9 @@
     </w:p>
     <w:p>
       <w:pPr>
-        <w:spacing w:before="0" w:after="10" w:line="240" w:lineRule="exact"/>
+        <w:spacing w:before="0" w:after="4" w:line="230" w:lineRule="exact"/>
         <w:tabs>
-          <w:tab w:val="right" w:pos="10376"/>
+          <w:tab w:val="right" w:pos="10602"/>
         </w:tabs>
       </w:pPr>
       <w:r>
@@ -431,7 +667,7 @@
     </w:p>
     <w:p>
       <w:pPr>
-        <w:spacing w:before="0" w:after="10" w:line="240" w:lineRule="exact"/>
+        <w:spacing w:before="0" w:after="3" w:line="230" w:lineRule="exact"/>
         <w:ind w:left="255" w:hanging="181"/>
       </w:pPr>
       <w:r>
@@ -442,12 +678,42 @@
           <w:color w:val="000000"/>
           <w:sz w:val="20"/>
         </w:rPr>
-        <w:t>•  Heat and cardiovascular admissions among older adults (Hospital Authority data), with Prof. David Bishai, HKU School of Public Health.</w:t>
+        <w:t xml:space="preserve">•  </w:t>
+      </w:r>
+      <w:r>
+        <w:rPr>
+          <w:rFonts w:ascii="Times New Roman" w:hAnsi="Times New Roman" w:eastAsia="Times New Roman"/>
+          <w:b w:val="0"/>
+          <w:i w:val="0"/>
+          <w:color w:val="000000"/>
+          <w:sz w:val="20"/>
+        </w:rPr>
+        <w:t xml:space="preserve">Heat and cardiovascular admissions among older adults using </w:t>
+      </w:r>
+      <w:r>
+        <w:rPr>
+          <w:rFonts w:ascii="Times New Roman" w:hAnsi="Times New Roman" w:eastAsia="Times New Roman"/>
+          <w:b/>
+          <w:i w:val="0"/>
+          <w:color w:val="000000"/>
+          <w:sz w:val="20"/>
+        </w:rPr>
+        <w:t>Hospital Authority</w:t>
+      </w:r>
+      <w:r>
+        <w:rPr>
+          <w:rFonts w:ascii="Times New Roman" w:hAnsi="Times New Roman" w:eastAsia="Times New Roman"/>
+          <w:b w:val="0"/>
+          <w:i w:val="0"/>
+          <w:color w:val="000000"/>
+          <w:sz w:val="20"/>
+        </w:rPr>
+        <w:t xml:space="preserve"> data, with Prof. David Bishai, HKU School of Public Health. Ongoing analysis toward dual-season hospital preparedness and cross-boundary heat-health surveillance.</w:t>
       </w:r>
     </w:p>
     <w:p>
       <w:pPr>
-        <w:spacing w:before="0" w:after="10" w:line="240" w:lineRule="exact"/>
+        <w:spacing w:before="0" w:after="3" w:line="230" w:lineRule="exact"/>
         <w:ind w:left="255" w:hanging="181"/>
       </w:pPr>
       <w:r>
@@ -458,14 +724,64 @@
           <w:color w:val="000000"/>
           <w:sz w:val="20"/>
         </w:rPr>
-        <w:t>•  Forthcoming, Oct 2026: invited speaker at the Global Conference on Environmental Science and Technology (GEST), Valencia; attending the Laidlaw Scholars Annual Conference, London.</w:t>
+        <w:t xml:space="preserve">•  </w:t>
+      </w:r>
+      <w:r>
+        <w:rPr>
+          <w:rFonts w:ascii="Times New Roman" w:hAnsi="Times New Roman" w:eastAsia="Times New Roman"/>
+          <w:b w:val="0"/>
+          <w:i w:val="0"/>
+          <w:color w:val="000000"/>
+          <w:sz w:val="20"/>
+        </w:rPr>
+        <w:t xml:space="preserve">Forthcoming, Oct 2026: </w:t>
+      </w:r>
+      <w:r>
+        <w:rPr>
+          <w:rFonts w:ascii="Times New Roman" w:hAnsi="Times New Roman" w:eastAsia="Times New Roman"/>
+          <w:b/>
+          <w:i w:val="0"/>
+          <w:color w:val="000000"/>
+          <w:sz w:val="20"/>
+        </w:rPr>
+        <w:t>invited speaker</w:t>
+      </w:r>
+      <w:r>
+        <w:rPr>
+          <w:rFonts w:ascii="Times New Roman" w:hAnsi="Times New Roman" w:eastAsia="Times New Roman"/>
+          <w:b w:val="0"/>
+          <w:i w:val="0"/>
+          <w:color w:val="000000"/>
+          <w:sz w:val="20"/>
+        </w:rPr>
+        <w:t xml:space="preserve">, Global Conference on Environmental Science and Technology (GEST), Valencia; </w:t>
+      </w:r>
+      <w:r>
+        <w:rPr>
+          <w:rFonts w:ascii="Times New Roman" w:hAnsi="Times New Roman" w:eastAsia="Times New Roman"/>
+          <w:b/>
+          <w:i w:val="0"/>
+          <w:color w:val="000000"/>
+          <w:sz w:val="20"/>
+        </w:rPr>
+        <w:t>attending</w:t>
+      </w:r>
+      <w:r>
+        <w:rPr>
+          <w:rFonts w:ascii="Times New Roman" w:hAnsi="Times New Roman" w:eastAsia="Times New Roman"/>
+          <w:b w:val="0"/>
+          <w:i w:val="0"/>
+          <w:color w:val="000000"/>
+          <w:sz w:val="20"/>
+        </w:rPr>
+        <w:t xml:space="preserve"> the Laidlaw Scholars Annual Conference, London.</w:t>
       </w:r>
     </w:p>
     <w:p>
       <w:pPr>
-        <w:spacing w:before="70" w:after="0" w:line="240" w:lineRule="exact"/>
+        <w:spacing w:before="32" w:after="0" w:line="230" w:lineRule="exact"/>
         <w:tabs>
-          <w:tab w:val="right" w:pos="10376"/>
+          <w:tab w:val="right" w:pos="10602"/>
         </w:tabs>
       </w:pPr>
       <w:r>
@@ -494,9 +810,9 @@
     </w:p>
     <w:p>
       <w:pPr>
-        <w:spacing w:before="0" w:after="10" w:line="240" w:lineRule="exact"/>
+        <w:spacing w:before="0" w:after="4" w:line="230" w:lineRule="exact"/>
         <w:tabs>
-          <w:tab w:val="right" w:pos="10376"/>
+          <w:tab w:val="right" w:pos="10602"/>
         </w:tabs>
       </w:pPr>
       <w:r>
@@ -525,7 +841,7 @@
     </w:p>
     <w:p>
       <w:pPr>
-        <w:spacing w:before="0" w:after="10" w:line="240" w:lineRule="exact"/>
+        <w:spacing w:before="0" w:after="3" w:line="230" w:lineRule="exact"/>
         <w:ind w:left="255" w:hanging="181"/>
       </w:pPr>
       <w:r>
@@ -536,14 +852,24 @@
           <w:color w:val="000000"/>
           <w:sz w:val="20"/>
         </w:rPr>
-        <w:t>•  Modelled GraphCast integration into Hong Kong forecasting; atmospheric-rivers identification presented at AGU.</w:t>
+        <w:t xml:space="preserve">•  </w:t>
+      </w:r>
+      <w:r>
+        <w:rPr>
+          <w:rFonts w:ascii="Times New Roman" w:hAnsi="Times New Roman" w:eastAsia="Times New Roman"/>
+          <w:b w:val="0"/>
+          <w:i w:val="0"/>
+          <w:color w:val="000000"/>
+          <w:sz w:val="20"/>
+        </w:rPr>
+        <w:t>Modelled GraphCast integration into Hong Kong forecasting; atmospheric-rivers identification presented at AGU.</w:t>
       </w:r>
     </w:p>
     <w:p>
       <w:pPr>
-        <w:spacing w:before="70" w:after="0" w:line="240" w:lineRule="exact"/>
+        <w:spacing w:before="32" w:after="0" w:line="230" w:lineRule="exact"/>
         <w:tabs>
-          <w:tab w:val="right" w:pos="10376"/>
+          <w:tab w:val="right" w:pos="10602"/>
         </w:tabs>
       </w:pPr>
       <w:r>
@@ -572,9 +898,9 @@
     </w:p>
     <w:p>
       <w:pPr>
-        <w:spacing w:before="0" w:after="10" w:line="240" w:lineRule="exact"/>
+        <w:spacing w:before="0" w:after="4" w:line="230" w:lineRule="exact"/>
         <w:tabs>
-          <w:tab w:val="right" w:pos="10376"/>
+          <w:tab w:val="right" w:pos="10602"/>
         </w:tabs>
       </w:pPr>
       <w:r>
@@ -603,7 +929,7 @@
     </w:p>
     <w:p>
       <w:pPr>
-        <w:spacing w:before="0" w:after="10" w:line="240" w:lineRule="exact"/>
+        <w:spacing w:before="0" w:after="3" w:line="230" w:lineRule="exact"/>
         <w:ind w:left="255" w:hanging="181"/>
       </w:pPr>
       <w:r>
@@ -614,14 +940,24 @@
           <w:color w:val="000000"/>
           <w:sz w:val="20"/>
         </w:rPr>
-        <w:t>•  Qiskit models and SpinQ auto-calibration; presented entanglement versus measurement work at physics-department seminars.</w:t>
+        <w:t xml:space="preserve">•  </w:t>
+      </w:r>
+      <w:r>
+        <w:rPr>
+          <w:rFonts w:ascii="Times New Roman" w:hAnsi="Times New Roman" w:eastAsia="Times New Roman"/>
+          <w:b w:val="0"/>
+          <w:i w:val="0"/>
+          <w:color w:val="000000"/>
+          <w:sz w:val="20"/>
+        </w:rPr>
+        <w:t>Qiskit models and SpinQ auto-calibration; presented entanglement versus measurement work at physics-department seminars.</w:t>
       </w:r>
     </w:p>
     <w:p>
       <w:pPr>
-        <w:spacing w:before="70" w:after="0" w:line="240" w:lineRule="exact"/>
+        <w:spacing w:before="32" w:after="0" w:line="230" w:lineRule="exact"/>
         <w:tabs>
-          <w:tab w:val="right" w:pos="10376"/>
+          <w:tab w:val="right" w:pos="10602"/>
         </w:tabs>
       </w:pPr>
       <w:r>
@@ -650,9 +986,9 @@
     </w:p>
     <w:p>
       <w:pPr>
-        <w:spacing w:before="0" w:after="10" w:line="240" w:lineRule="exact"/>
+        <w:spacing w:before="0" w:after="4" w:line="230" w:lineRule="exact"/>
         <w:tabs>
-          <w:tab w:val="right" w:pos="10376"/>
+          <w:tab w:val="right" w:pos="10602"/>
         </w:tabs>
       </w:pPr>
       <w:r>
@@ -681,7 +1017,7 @@
     </w:p>
     <w:p>
       <w:pPr>
-        <w:spacing w:before="0" w:after="10" w:line="240" w:lineRule="exact"/>
+        <w:spacing w:before="0" w:after="3" w:line="230" w:lineRule="exact"/>
         <w:ind w:left="255" w:hanging="181"/>
       </w:pPr>
       <w:r>
@@ -692,15 +1028,25 @@
           <w:color w:val="000000"/>
           <w:sz w:val="20"/>
         </w:rPr>
-        <w:t>•  Prototyped MEDocGPT, an LLM healthcare chatbot and mobile app for early health intervention.</w:t>
+        <w:t xml:space="preserve">•  </w:t>
+      </w:r>
+      <w:r>
+        <w:rPr>
+          <w:rFonts w:ascii="Times New Roman" w:hAnsi="Times New Roman" w:eastAsia="Times New Roman"/>
+          <w:b w:val="0"/>
+          <w:i w:val="0"/>
+          <w:color w:val="000000"/>
+          <w:sz w:val="20"/>
+        </w:rPr>
+        <w:t>Prototyped MEDocGPT, an LLM healthcare chatbot and mobile app for early health intervention.</w:t>
       </w:r>
     </w:p>
     <w:p>
       <w:pPr>
-        <w:spacing w:before="140" w:after="20" w:line="240" w:lineRule="exact"/>
+        <w:spacing w:before="80" w:after="10" w:line="220" w:lineRule="exact"/>
         <w:jc w:val="left"/>
         <w:pBdr>
-          <w:bottom w:val="single" w:sz="12" w:space="4" w:color="000000"/>
+          <w:bottom w:val="single" w:sz="11" w:space="3" w:color="000000"/>
         </w:pBdr>
       </w:pPr>
       <w:r>
@@ -711,14 +1057,14 @@
           <w:color w:val="000000"/>
           <w:sz w:val="22"/>
         </w:rPr>
-        <w:t>FIELDWORK AND LEADERSHIP</w:t>
+        <w:t>LEADERSHIP</w:t>
       </w:r>
     </w:p>
     <w:p>
       <w:pPr>
-        <w:spacing w:before="70" w:after="0" w:line="240" w:lineRule="exact"/>
+        <w:spacing w:before="32" w:after="0" w:line="230" w:lineRule="exact"/>
         <w:tabs>
-          <w:tab w:val="right" w:pos="10376"/>
+          <w:tab w:val="right" w:pos="10602"/>
         </w:tabs>
       </w:pPr>
       <w:r>
@@ -729,7 +1075,7 @@
           <w:color w:val="000000"/>
           <w:sz w:val="21"/>
         </w:rPr>
-        <w:t>Wu Zhi Qiao (HKU)</w:t>
+        <w:t>Wu Zhi Qiao (WZQ, HKU)</w:t>
       </w:r>
       <w:r>
         <w:tab/>
@@ -747,9 +1093,9 @@
     </w:p>
     <w:p>
       <w:pPr>
-        <w:spacing w:before="0" w:after="10" w:line="240" w:lineRule="exact"/>
+        <w:spacing w:before="0" w:after="4" w:line="230" w:lineRule="exact"/>
         <w:tabs>
-          <w:tab w:val="right" w:pos="10376"/>
+          <w:tab w:val="right" w:pos="10602"/>
         </w:tabs>
       </w:pPr>
       <w:r>
@@ -760,7 +1106,7 @@
           <w:color w:val="000000"/>
           <w:sz w:val="20"/>
         </w:rPr>
-        <w:t>Student Coordinator</w:t>
+        <w:t>Student Coordinator (1 of 3)</w:t>
       </w:r>
       <w:r>
         <w:tab/>
@@ -778,7 +1124,7 @@
     </w:p>
     <w:p>
       <w:pPr>
-        <w:spacing w:before="0" w:after="10" w:line="240" w:lineRule="exact"/>
+        <w:spacing w:before="0" w:after="3" w:line="230" w:lineRule="exact"/>
         <w:ind w:left="255" w:hanging="181"/>
       </w:pPr>
       <w:r>
@@ -789,14 +1135,24 @@
           <w:color w:val="000000"/>
           <w:sz w:val="20"/>
         </w:rPr>
-        <w:t>•  Coordinated on-site student service in rural health and infrastructure.</w:t>
+        <w:t xml:space="preserve">•  </w:t>
+      </w:r>
+      <w:r>
+        <w:rPr>
+          <w:rFonts w:ascii="Times New Roman" w:hAnsi="Times New Roman" w:eastAsia="Times New Roman"/>
+          <w:b w:val="0"/>
+          <w:i w:val="0"/>
+          <w:color w:val="000000"/>
+          <w:sz w:val="20"/>
+        </w:rPr>
+        <w:t>One of three student coordinators for on-site rural health and infrastructure service: logistics, listening, and turning village needs into feasible student work.</w:t>
       </w:r>
     </w:p>
     <w:p>
       <w:pPr>
-        <w:spacing w:before="70" w:after="0" w:line="240" w:lineRule="exact"/>
+        <w:spacing w:before="32" w:after="0" w:line="230" w:lineRule="exact"/>
         <w:tabs>
-          <w:tab w:val="right" w:pos="10376"/>
+          <w:tab w:val="right" w:pos="10602"/>
         </w:tabs>
       </w:pPr>
       <w:r>
@@ -825,9 +1181,9 @@
     </w:p>
     <w:p>
       <w:pPr>
-        <w:spacing w:before="0" w:after="10" w:line="240" w:lineRule="exact"/>
+        <w:spacing w:before="0" w:after="4" w:line="230" w:lineRule="exact"/>
         <w:tabs>
-          <w:tab w:val="right" w:pos="10376"/>
+          <w:tab w:val="right" w:pos="10602"/>
         </w:tabs>
       </w:pPr>
       <w:r>
@@ -856,7 +1212,7 @@
     </w:p>
     <w:p>
       <w:pPr>
-        <w:spacing w:before="0" w:after="10" w:line="240" w:lineRule="exact"/>
+        <w:spacing w:before="0" w:after="3" w:line="230" w:lineRule="exact"/>
         <w:ind w:left="255" w:hanging="181"/>
       </w:pPr>
       <w:r>
@@ -867,14 +1223,24 @@
           <w:color w:val="000000"/>
           <w:sz w:val="20"/>
         </w:rPr>
-        <w:t>•  Field observation of livelihoods and trust.</w:t>
+        <w:t xml:space="preserve">•  </w:t>
+      </w:r>
+      <w:r>
+        <w:rPr>
+          <w:rFonts w:ascii="Times New Roman" w:hAnsi="Times New Roman" w:eastAsia="Times New Roman"/>
+          <w:b w:val="0"/>
+          <w:i w:val="0"/>
+          <w:color w:val="000000"/>
+          <w:sz w:val="20"/>
+        </w:rPr>
+        <w:t>Field observation of livelihoods and trust (Wudu industrial retirees; temple-as-clinic; grassland restoration).</w:t>
       </w:r>
     </w:p>
     <w:p>
       <w:pPr>
-        <w:spacing w:before="70" w:after="0" w:line="240" w:lineRule="exact"/>
+        <w:spacing w:before="32" w:after="0" w:line="230" w:lineRule="exact"/>
         <w:tabs>
-          <w:tab w:val="right" w:pos="10376"/>
+          <w:tab w:val="right" w:pos="10602"/>
         </w:tabs>
       </w:pPr>
       <w:r>
@@ -903,9 +1269,9 @@
     </w:p>
     <w:p>
       <w:pPr>
-        <w:spacing w:before="0" w:after="10" w:line="240" w:lineRule="exact"/>
+        <w:spacing w:before="0" w:after="4" w:line="230" w:lineRule="exact"/>
         <w:tabs>
-          <w:tab w:val="right" w:pos="10376"/>
+          <w:tab w:val="right" w:pos="10602"/>
         </w:tabs>
       </w:pPr>
       <w:r>
@@ -916,7 +1282,7 @@
           <w:color w:val="000000"/>
           <w:sz w:val="20"/>
         </w:rPr>
-        <w:t>Participant, Nansen Academy</w:t>
+        <w:t>Selected participant, Nansen Academy (1 of 3 HKU)</w:t>
       </w:r>
       <w:r>
         <w:tab/>
@@ -934,7 +1300,7 @@
     </w:p>
     <w:p>
       <w:pPr>
-        <w:spacing w:before="0" w:after="10" w:line="240" w:lineRule="exact"/>
+        <w:spacing w:before="0" w:after="3" w:line="230" w:lineRule="exact"/>
         <w:ind w:left="255" w:hanging="181"/>
       </w:pPr>
       <w:r>
@@ -945,14 +1311,24 @@
           <w:color w:val="000000"/>
           <w:sz w:val="20"/>
         </w:rPr>
-        <w:t>•  Nine-day residential East-West dialogue (East Asia and Nordics).</w:t>
+        <w:t xml:space="preserve">•  </w:t>
+      </w:r>
+      <w:r>
+        <w:rPr>
+          <w:rFonts w:ascii="Times New Roman" w:hAnsi="Times New Roman" w:eastAsia="Times New Roman"/>
+          <w:b w:val="0"/>
+          <w:i w:val="0"/>
+          <w:color w:val="000000"/>
+          <w:sz w:val="20"/>
+        </w:rPr>
+        <w:t>Nine-day residential East-West dialogue (East Asia x Nordics). Then independent Nordic fieldwork, Oslo-Stockholm-Helsinki, 6-20 Aug 2026 (not a second academy).</w:t>
       </w:r>
     </w:p>
     <w:p>
       <w:pPr>
-        <w:spacing w:before="70" w:after="0" w:line="240" w:lineRule="exact"/>
+        <w:spacing w:before="32" w:after="0" w:line="230" w:lineRule="exact"/>
         <w:tabs>
-          <w:tab w:val="right" w:pos="10376"/>
+          <w:tab w:val="right" w:pos="10602"/>
         </w:tabs>
       </w:pPr>
       <w:r>
@@ -981,9 +1357,9 @@
     </w:p>
     <w:p>
       <w:pPr>
-        <w:spacing w:before="0" w:after="10" w:line="240" w:lineRule="exact"/>
+        <w:spacing w:before="0" w:after="4" w:line="230" w:lineRule="exact"/>
         <w:tabs>
-          <w:tab w:val="right" w:pos="10376"/>
+          <w:tab w:val="right" w:pos="10602"/>
         </w:tabs>
       </w:pPr>
       <w:r>
@@ -1012,7 +1388,7 @@
     </w:p>
     <w:p>
       <w:pPr>
-        <w:spacing w:before="0" w:after="10" w:line="240" w:lineRule="exact"/>
+        <w:spacing w:before="0" w:after="3" w:line="230" w:lineRule="exact"/>
         <w:ind w:left="255" w:hanging="181"/>
       </w:pPr>
       <w:r>
@@ -1023,14 +1399,24 @@
           <w:color w:val="000000"/>
           <w:sz w:val="20"/>
         </w:rPr>
-        <w:t>•  Worked with 20+ Shaw Laureates, young scientists, and the HKLF Secretariat.</w:t>
+        <w:t xml:space="preserve">•  </w:t>
+      </w:r>
+      <w:r>
+        <w:rPr>
+          <w:rFonts w:ascii="Times New Roman" w:hAnsi="Times New Roman" w:eastAsia="Times New Roman"/>
+          <w:b w:val="0"/>
+          <w:i w:val="0"/>
+          <w:color w:val="000000"/>
+          <w:sz w:val="20"/>
+        </w:rPr>
+        <w:t>Worked with 20+ Shaw Laureates, young scientists, and the HKLF Secretariat.</w:t>
       </w:r>
     </w:p>
     <w:p>
       <w:pPr>
-        <w:spacing w:before="70" w:after="0" w:line="240" w:lineRule="exact"/>
+        <w:spacing w:before="32" w:after="0" w:line="230" w:lineRule="exact"/>
         <w:tabs>
-          <w:tab w:val="right" w:pos="10376"/>
+          <w:tab w:val="right" w:pos="10602"/>
         </w:tabs>
       </w:pPr>
       <w:r>
@@ -1059,9 +1445,9 @@
     </w:p>
     <w:p>
       <w:pPr>
-        <w:spacing w:before="0" w:after="10" w:line="240" w:lineRule="exact"/>
+        <w:spacing w:before="0" w:after="4" w:line="230" w:lineRule="exact"/>
         <w:tabs>
-          <w:tab w:val="right" w:pos="10376"/>
+          <w:tab w:val="right" w:pos="10602"/>
         </w:tabs>
       </w:pPr>
       <w:r>
@@ -1090,7 +1476,7 @@
     </w:p>
     <w:p>
       <w:pPr>
-        <w:spacing w:before="0" w:after="10" w:line="240" w:lineRule="exact"/>
+        <w:spacing w:before="0" w:after="3" w:line="230" w:lineRule="exact"/>
         <w:ind w:left="255" w:hanging="181"/>
       </w:pPr>
       <w:r>
@@ -1101,12 +1487,126 @@
           <w:color w:val="000000"/>
           <w:sz w:val="20"/>
         </w:rPr>
-        <w:t>•  Ten-day programme in game theory, Bayesian inference, and Fermi estimation.</w:t>
+        <w:t xml:space="preserve">•  </w:t>
+      </w:r>
+      <w:r>
+        <w:rPr>
+          <w:rFonts w:ascii="Times New Roman" w:hAnsi="Times New Roman" w:eastAsia="Times New Roman"/>
+          <w:b w:val="0"/>
+          <w:i w:val="0"/>
+          <w:color w:val="000000"/>
+          <w:sz w:val="20"/>
+        </w:rPr>
+        <w:t>Ten-day programme in game theory, Bayesian inference, and Fermi estimation.</w:t>
+      </w:r>
+    </w:p>
+    <w:p>
+      <w:pPr>
+        <w:spacing w:before="80" w:after="10" w:line="220" w:lineRule="exact"/>
+        <w:jc w:val="left"/>
+        <w:pBdr>
+          <w:bottom w:val="single" w:sz="11" w:space="3" w:color="000000"/>
+        </w:pBdr>
+      </w:pPr>
+      <w:r>
+        <w:rPr>
+          <w:rFonts w:ascii="Times New Roman" w:hAnsi="Times New Roman" w:eastAsia="Times New Roman"/>
+          <w:b/>
+          <w:i w:val="0"/>
+          <w:color w:val="000000"/>
+          <w:sz w:val="22"/>
+        </w:rPr>
+        <w:t>SKILLS</w:t>
+      </w:r>
+    </w:p>
+    <w:p>
+      <w:pPr>
+        <w:spacing w:before="0" w:after="0" w:line="240" w:lineRule="exact"/>
+      </w:pPr>
+      <w:r>
+        <w:rPr>
+          <w:rFonts w:ascii="Times New Roman" w:hAnsi="Times New Roman" w:eastAsia="Times New Roman"/>
+          <w:b/>
+          <w:i w:val="0"/>
+          <w:color w:val="000000"/>
+          <w:sz w:val="20"/>
+        </w:rPr>
+        <w:t xml:space="preserve">Languages: </w:t>
+      </w:r>
+      <w:r>
+        <w:rPr>
+          <w:rFonts w:ascii="Times New Roman" w:hAnsi="Times New Roman" w:eastAsia="Times New Roman"/>
+          <w:b w:val="0"/>
+          <w:i w:val="0"/>
+          <w:color w:val="000000"/>
+          <w:sz w:val="20"/>
+        </w:rPr>
+        <w:t xml:space="preserve">English; Mandarin. </w:t>
+      </w:r>
+      <w:r>
+        <w:rPr>
+          <w:rFonts w:ascii="Times New Roman" w:hAnsi="Times New Roman" w:eastAsia="Times New Roman"/>
+          <w:b/>
+          <w:i w:val="0"/>
+          <w:color w:val="000000"/>
+          <w:sz w:val="20"/>
+        </w:rPr>
+        <w:t xml:space="preserve">Methods: </w:t>
+      </w:r>
+      <w:r>
+        <w:rPr>
+          <w:rFonts w:ascii="Times New Roman" w:hAnsi="Times New Roman" w:eastAsia="Times New Roman"/>
+          <w:b w:val="0"/>
+          <w:i w:val="0"/>
+          <w:color w:val="000000"/>
+          <w:sz w:val="20"/>
+        </w:rPr>
+        <w:t xml:space="preserve">quantitative analysis; public-health fieldwork; student coordination. </w:t>
+      </w:r>
+      <w:r>
+        <w:rPr>
+          <w:rFonts w:ascii="Times New Roman" w:hAnsi="Times New Roman" w:eastAsia="Times New Roman"/>
+          <w:b/>
+          <w:i w:val="0"/>
+          <w:color w:val="000000"/>
+          <w:sz w:val="20"/>
+        </w:rPr>
+        <w:t xml:space="preserve">Tools: </w:t>
+      </w:r>
+      <w:r>
+        <w:rPr>
+          <w:rFonts w:ascii="Times New Roman" w:hAnsi="Times New Roman" w:eastAsia="Times New Roman"/>
+          <w:b w:val="0"/>
+          <w:i w:val="0"/>
+          <w:color w:val="000000"/>
+          <w:sz w:val="20"/>
+        </w:rPr>
+        <w:t xml:space="preserve">Qiskit; GraphCast. </w:t>
+      </w:r>
+      <w:r>
+        <w:rPr>
+          <w:rFonts w:ascii="Times New Roman" w:hAnsi="Times New Roman" w:eastAsia="Times New Roman"/>
+          <w:b/>
+          <w:i w:val="0"/>
+          <w:color w:val="000000"/>
+          <w:sz w:val="20"/>
+        </w:rPr>
+        <w:t xml:space="preserve">Domain: </w:t>
+      </w:r>
+      <w:r>
+        <w:rPr>
+          <w:rFonts w:ascii="Times New Roman" w:hAnsi="Times New Roman" w:eastAsia="Times New Roman"/>
+          <w:b w:val="0"/>
+          <w:i w:val="0"/>
+          <w:color w:val="000000"/>
+          <w:sz w:val="20"/>
+        </w:rPr>
+        <w:t>heat-health, ageing, Hospital Authority data, rural service.</w:t>
       </w:r>
     </w:p>
     <w:sectPr>
       <w:pgSz w:w="11906" w:h="16838"/>
-      <w:pgMar w:top="652" w:right="765" w:bottom="652" w:left="765" w:header="720" w:footer="720" w:gutter="0"/>
+      <w:pgMar w:top="539" w:right="652" w:bottom="539" w:left="652" w:header="720" w:footer="720" w:gutter="0"/>
       <w:cols w:space="720"/>
       <w:docGrid w:linePitch="360"/>
     </w:sectPr>

</xml_diff>

<commit_message>
Trim CV skills to Python/R/C++ and list Cantonese
Drop the Gannan Horizons trip and the Tung and Ngai ceiling disclaimer.
Give Young Writers its own honours line.

Co-authored-by: Shen Ruililin <bobshenruililin@users.noreply.github.com>
</commit_message>
<xml_diff>
--- a/cv/shen-ruililin-cv.docx
+++ b/cv/shen-ruililin-cv.docx
@@ -396,27 +396,7 @@
           <w:color w:val="000000"/>
           <w:sz w:val="20"/>
         </w:rPr>
-        <w:t xml:space="preserve">. Four-year package ceiling </w:t>
-      </w:r>
-      <w:r>
-        <w:rPr>
-          <w:rFonts w:ascii="Times New Roman" w:hAnsi="Times New Roman" w:eastAsia="Times New Roman"/>
-          <w:b/>
-          <w:i w:val="0"/>
-          <w:color w:val="000000"/>
-          <w:sz w:val="20"/>
-        </w:rPr>
-        <w:t>up to ~HK$520,000</w:t>
-      </w:r>
-      <w:r>
-        <w:rPr>
-          <w:rFonts w:ascii="Times New Roman" w:hAnsi="Times New Roman" w:eastAsia="Times New Roman"/>
-          <w:b w:val="0"/>
-          <w:i w:val="0"/>
-          <w:color w:val="000000"/>
-          <w:sz w:val="20"/>
-        </w:rPr>
-        <w:t xml:space="preserve"> if duration and published maxima are drawn — not a single disbursement.</w:t>
+        <w:t>.</w:t>
       </w:r>
     </w:p>
     <w:p>
@@ -561,8 +541,13 @@
           <w:color w:val="000000"/>
           <w:sz w:val="20"/>
         </w:rPr>
-        <w:t xml:space="preserve"> (Hong Kong): Champion 2022 (1st/16); first runner-up 2021 (2nd/8). </w:t>
+        <w:t xml:space="preserve"> (Hong Kong): Champion 2022 (1st/16); first runner-up 2021 (2nd/8).</w:t>
       </w:r>
+    </w:p>
+    <w:p>
+      <w:pPr>
+        <w:spacing w:before="0" w:after="10" w:line="230" w:lineRule="exact"/>
+      </w:pPr>
       <w:r>
         <w:rPr>
           <w:rFonts w:ascii="Times New Roman" w:hAnsi="Times New Roman" w:eastAsia="Times New Roman"/>
@@ -1163,94 +1148,6 @@
           <w:color w:val="000000"/>
           <w:sz w:val="21"/>
         </w:rPr>
-        <w:t>HKU Horizons</w:t>
-      </w:r>
-      <w:r>
-        <w:tab/>
-      </w:r>
-      <w:r>
-        <w:rPr>
-          <w:rFonts w:ascii="Times New Roman" w:hAnsi="Times New Roman" w:eastAsia="Times New Roman"/>
-          <w:b/>
-          <w:i w:val="0"/>
-          <w:color w:val="000000"/>
-          <w:sz w:val="21"/>
-        </w:rPr>
-        <w:t>Gannan, Gansu</w:t>
-      </w:r>
-    </w:p>
-    <w:p>
-      <w:pPr>
-        <w:spacing w:before="0" w:after="4" w:line="230" w:lineRule="exact"/>
-        <w:tabs>
-          <w:tab w:val="right" w:pos="10602"/>
-        </w:tabs>
-      </w:pPr>
-      <w:r>
-        <w:rPr>
-          <w:rFonts w:ascii="Times New Roman" w:hAnsi="Times New Roman" w:eastAsia="Times New Roman"/>
-          <w:b w:val="0"/>
-          <w:i w:val="0"/>
-          <w:color w:val="000000"/>
-          <w:sz w:val="20"/>
-        </w:rPr>
-        <w:t>Participant</w:t>
-      </w:r>
-      <w:r>
-        <w:tab/>
-      </w:r>
-      <w:r>
-        <w:rPr>
-          <w:rFonts w:ascii="Times New Roman" w:hAnsi="Times New Roman" w:eastAsia="Times New Roman"/>
-          <w:b w:val="0"/>
-          <w:i w:val="0"/>
-          <w:color w:val="000000"/>
-          <w:sz w:val="20"/>
-        </w:rPr>
-        <w:t>Mar 2026</w:t>
-      </w:r>
-    </w:p>
-    <w:p>
-      <w:pPr>
-        <w:spacing w:before="0" w:after="3" w:line="230" w:lineRule="exact"/>
-        <w:ind w:left="255" w:hanging="181"/>
-      </w:pPr>
-      <w:r>
-        <w:rPr>
-          <w:rFonts w:ascii="Times New Roman" w:hAnsi="Times New Roman" w:eastAsia="Times New Roman"/>
-          <w:b w:val="0"/>
-          <w:i w:val="0"/>
-          <w:color w:val="000000"/>
-          <w:sz w:val="20"/>
-        </w:rPr>
-        <w:t xml:space="preserve">•  </w:t>
-      </w:r>
-      <w:r>
-        <w:rPr>
-          <w:rFonts w:ascii="Times New Roman" w:hAnsi="Times New Roman" w:eastAsia="Times New Roman"/>
-          <w:b w:val="0"/>
-          <w:i w:val="0"/>
-          <w:color w:val="000000"/>
-          <w:sz w:val="20"/>
-        </w:rPr>
-        <w:t>Field observation of livelihoods and trust (Wudu industrial retirees; temple-as-clinic; grassland restoration).</w:t>
-      </w:r>
-    </w:p>
-    <w:p>
-      <w:pPr>
-        <w:spacing w:before="32" w:after="0" w:line="230" w:lineRule="exact"/>
-        <w:tabs>
-          <w:tab w:val="right" w:pos="10602"/>
-        </w:tabs>
-      </w:pPr>
-      <w:r>
-        <w:rPr>
-          <w:rFonts w:ascii="Times New Roman" w:hAnsi="Times New Roman" w:eastAsia="Times New Roman"/>
-          <w:b/>
-          <w:i w:val="0"/>
-          <w:color w:val="000000"/>
-          <w:sz w:val="21"/>
-        </w:rPr>
         <w:t>NEWDAY - Nansen East-West Dialogue Academy</w:t>
       </w:r>
       <w:r>
@@ -1541,7 +1438,7 @@
           <w:color w:val="000000"/>
           <w:sz w:val="20"/>
         </w:rPr>
-        <w:t xml:space="preserve">English; Mandarin. </w:t>
+        <w:t xml:space="preserve">Cantonese, Mandarin, English. </w:t>
       </w:r>
       <w:r>
         <w:rPr>
@@ -1551,7 +1448,7 @@
           <w:color w:val="000000"/>
           <w:sz w:val="20"/>
         </w:rPr>
-        <w:t xml:space="preserve">Methods: </w:t>
+        <w:t xml:space="preserve">Programming: </w:t>
       </w:r>
       <w:r>
         <w:rPr>
@@ -1561,47 +1458,7 @@
           <w:color w:val="000000"/>
           <w:sz w:val="20"/>
         </w:rPr>
-        <w:t xml:space="preserve">quantitative analysis; public-health fieldwork; student coordination. </w:t>
-      </w:r>
-      <w:r>
-        <w:rPr>
-          <w:rFonts w:ascii="Times New Roman" w:hAnsi="Times New Roman" w:eastAsia="Times New Roman"/>
-          <w:b/>
-          <w:i w:val="0"/>
-          <w:color w:val="000000"/>
-          <w:sz w:val="20"/>
-        </w:rPr>
-        <w:t xml:space="preserve">Tools: </w:t>
-      </w:r>
-      <w:r>
-        <w:rPr>
-          <w:rFonts w:ascii="Times New Roman" w:hAnsi="Times New Roman" w:eastAsia="Times New Roman"/>
-          <w:b w:val="0"/>
-          <w:i w:val="0"/>
-          <w:color w:val="000000"/>
-          <w:sz w:val="20"/>
-        </w:rPr>
-        <w:t xml:space="preserve">Qiskit; GraphCast. </w:t>
-      </w:r>
-      <w:r>
-        <w:rPr>
-          <w:rFonts w:ascii="Times New Roman" w:hAnsi="Times New Roman" w:eastAsia="Times New Roman"/>
-          <w:b/>
-          <w:i w:val="0"/>
-          <w:color w:val="000000"/>
-          <w:sz w:val="20"/>
-        </w:rPr>
-        <w:t xml:space="preserve">Domain: </w:t>
-      </w:r>
-      <w:r>
-        <w:rPr>
-          <w:rFonts w:ascii="Times New Roman" w:hAnsi="Times New Roman" w:eastAsia="Times New Roman"/>
-          <w:b w:val="0"/>
-          <w:i w:val="0"/>
-          <w:color w:val="000000"/>
-          <w:sz w:val="20"/>
-        </w:rPr>
-        <w:t>heat-health, ageing, Hospital Authority data, rural service.</w:t>
+        <w:t>Python, R, C++.</w:t>
       </w:r>
     </w:p>
     <w:sectPr>

</xml_diff>